<commit_message>
feat: requests for inn, date of strahova and so on
</commit_message>
<xml_diff>
--- a/bot/templates/template_contract.docx
+++ b/bot/templates/template_contract.docx
@@ -1880,6 +1880,9 @@
                 <w:color w:val="000000"/>
               </w:rPr>
             </w:pPr>
+            <w:r>
+              <w:t>ИНН: {{inn}}</w:t>
+            </w:r>
           </w:p>
           <w:p>
             <w:pPr>
@@ -1890,6 +1893,9 @@
                 <w:color w:val="000000"/>
               </w:rPr>
             </w:pPr>
+            <w:r>
+              <w:t>Телефон: {{phone}}</w:t>
+            </w:r>
           </w:p>
           <w:p>
             <w:pPr>
@@ -1900,6 +1906,9 @@
                 <w:color w:val="000000"/>
               </w:rPr>
             </w:pPr>
+            <w:r>
+              <w:t>Полис ДМС: № {{dms_number}} (до {{dms_date}})</w:t>
+            </w:r>
           </w:p>
           <w:p>
             <w:pPr>

</xml_diff>

<commit_message>
Make employer dynamic in Contract, Conclusion, and Termination docs; update patent doc filename based on citizenship
</commit_message>
<xml_diff>
--- a/bot/templates/template_contract.docx
+++ b/bot/templates/template_contract.docx
@@ -194,7 +194,7 @@
         </w:rPr>
       </w:pPr>
       <w:r>
-        <w:t>Индивидуальный предприниматель Глава крестьянского (фермерского) хозяйства Генералов Александр Валериевич, действующий на основании. ОГРН 319302500024366, ИНН 312009347140, именуемый в дальнейшем «Заказчик» и гражданин {{citizenship}} {{full_name}}, {{birth_date}} года рождения, паспорт серия {{passport_series}} №{{passport_number}} выдан {{passport_issue_date}}г. {{passport_issued_by}}, зарегистрированный по адресу: {{address}}, именуемый в дальнейшем «Подрядчик» (далее «Стороны»), заключили настоящий договор о нижеследующем:</w:t>
+        <w:t>Индивидуальный предприниматель Глава крестьянского (фермерского) хозяйства {{ employer_name }}, действующий на основании. ОГРН {{ employer_ogrn }}, ИНН {{ employer_inn }}, именуемый в дальнейшем «Заказчик» и гражданин {{citizenship}} {{full_name}}, {{birth_date}} года рождения, паспорт серия {{passport_series}} №{{passport_number}} выдан {{passport_issue_date}}г. {{passport_issued_by}}, зарегистрированный по адресу: {{address}}, именуемый в дальнейшем «Подрядчик» (далее «Стороны»), заключили настоящий договор о нижеследующем:</w:t>
       </w:r>
     </w:p>
     <w:p>
@@ -1436,28 +1436,7 @@
               </w:rPr>
             </w:pPr>
             <w:r>
-              <w:rPr>
-                <w:rFonts w:ascii="Times New Roman" w:eastAsia="Times New Roman" w:hAnsi="Times New Roman" w:cs="Times New Roman"/>
-                <w:b/>
-                <w:color w:val="000000"/>
-              </w:rPr>
-              <w:t xml:space="preserve">ИП </w:t>
-            </w:r>
-            <w:r>
-              <w:rPr>
-                <w:rFonts w:ascii="Times New Roman" w:eastAsia="Times New Roman" w:hAnsi="Times New Roman" w:cs="Times New Roman"/>
-                <w:b/>
-                <w:color w:val="000000"/>
-              </w:rPr>
-              <w:t xml:space="preserve">ГКФХ </w:t>
-            </w:r>
-            <w:r>
-              <w:rPr>
-                <w:rFonts w:ascii="Times New Roman" w:eastAsia="Times New Roman" w:hAnsi="Times New Roman" w:cs="Times New Roman"/>
-                <w:b/>
-                <w:color w:val="000000"/>
-              </w:rPr>
-              <w:t>Генералов Александр Валериевич</w:t>
+              <w:t>ИП ГКФХ {{ employer_name }}</w:t>
             </w:r>
           </w:p>
           <w:p>
@@ -1469,123 +1448,7 @@
               </w:rPr>
             </w:pPr>
             <w:r>
-              <w:rPr>
-                <w:rFonts w:ascii="Times New Roman" w:eastAsia="Times New Roman" w:hAnsi="Times New Roman" w:cs="Times New Roman"/>
-                <w:color w:val="000000"/>
-              </w:rPr>
-              <w:t>4165</w:t>
-            </w:r>
-            <w:r>
-              <w:rPr>
-                <w:rFonts w:ascii="Times New Roman" w:eastAsia="Times New Roman" w:hAnsi="Times New Roman" w:cs="Times New Roman"/>
-                <w:color w:val="000000"/>
-              </w:rPr>
-              <w:t>1</w:t>
-            </w:r>
-            <w:r>
-              <w:rPr>
-                <w:rFonts w:ascii="Times New Roman" w:eastAsia="Times New Roman" w:hAnsi="Times New Roman" w:cs="Times New Roman"/>
-                <w:color w:val="000000"/>
-              </w:rPr>
-              <w:t>1,</w:t>
-            </w:r>
-            <w:r>
-              <w:rPr>
-                <w:rFonts w:ascii="Times New Roman" w:eastAsia="Times New Roman" w:hAnsi="Times New Roman" w:cs="Times New Roman"/>
-                <w:color w:val="000000"/>
-              </w:rPr>
-              <w:t xml:space="preserve"> Астраханская</w:t>
-            </w:r>
-            <w:r>
-              <w:rPr>
-                <w:rFonts w:ascii="Times New Roman" w:eastAsia="Times New Roman" w:hAnsi="Times New Roman" w:cs="Times New Roman"/>
-                <w:color w:val="000000"/>
-              </w:rPr>
-              <w:t xml:space="preserve"> </w:t>
-            </w:r>
-            <w:r>
-              <w:rPr>
-                <w:rFonts w:ascii="Times New Roman" w:eastAsia="Times New Roman" w:hAnsi="Times New Roman" w:cs="Times New Roman"/>
-                <w:color w:val="000000"/>
-              </w:rPr>
-              <w:t>обл.</w:t>
-            </w:r>
-            <w:r>
-              <w:rPr>
-                <w:rFonts w:ascii="Times New Roman" w:eastAsia="Times New Roman" w:hAnsi="Times New Roman" w:cs="Times New Roman"/>
-                <w:color w:val="000000"/>
-              </w:rPr>
-              <w:t xml:space="preserve">, </w:t>
-            </w:r>
-            <w:r>
-              <w:rPr>
-                <w:rFonts w:ascii="Times New Roman" w:eastAsia="Times New Roman" w:hAnsi="Times New Roman" w:cs="Times New Roman"/>
-                <w:color w:val="000000"/>
-              </w:rPr>
-              <w:t>Ахтубинский район</w:t>
-            </w:r>
-            <w:r>
-              <w:rPr>
-                <w:rFonts w:ascii="Times New Roman" w:eastAsia="Times New Roman" w:hAnsi="Times New Roman" w:cs="Times New Roman"/>
-                <w:color w:val="000000"/>
-              </w:rPr>
-              <w:t>,</w:t>
-            </w:r>
-            <w:r>
-              <w:rPr>
-                <w:rFonts w:ascii="Times New Roman" w:eastAsia="Times New Roman" w:hAnsi="Times New Roman" w:cs="Times New Roman"/>
-                <w:color w:val="000000"/>
-              </w:rPr>
-              <w:t xml:space="preserve"> </w:t>
-            </w:r>
-            <w:r>
-              <w:rPr>
-                <w:rFonts w:ascii="Times New Roman" w:eastAsia="Times New Roman" w:hAnsi="Times New Roman" w:cs="Times New Roman"/>
-                <w:color w:val="000000"/>
-              </w:rPr>
-              <w:t>с.</w:t>
-            </w:r>
-            <w:r>
-              <w:rPr>
-                <w:rFonts w:ascii="Times New Roman" w:eastAsia="Times New Roman" w:hAnsi="Times New Roman" w:cs="Times New Roman"/>
-                <w:color w:val="000000"/>
-              </w:rPr>
-              <w:t xml:space="preserve"> </w:t>
-            </w:r>
-            <w:r>
-              <w:rPr>
-                <w:rFonts w:ascii="Times New Roman" w:eastAsia="Times New Roman" w:hAnsi="Times New Roman" w:cs="Times New Roman"/>
-                <w:color w:val="000000"/>
-              </w:rPr>
-              <w:t>Покровка.</w:t>
-            </w:r>
-            <w:r>
-              <w:rPr>
-                <w:rFonts w:ascii="Times New Roman" w:eastAsia="Times New Roman" w:hAnsi="Times New Roman" w:cs="Times New Roman"/>
-                <w:color w:val="000000"/>
-              </w:rPr>
-              <w:t xml:space="preserve"> </w:t>
-            </w:r>
-            <w:r>
-              <w:rPr>
-                <w:rFonts w:ascii="Times New Roman" w:eastAsia="Times New Roman" w:hAnsi="Times New Roman" w:cs="Times New Roman"/>
-                <w:color w:val="000000"/>
-              </w:rPr>
-              <w:t>ул.</w:t>
-            </w:r>
-            <w:r>
-              <w:rPr>
-                <w:rFonts w:ascii="Times New Roman" w:eastAsia="Times New Roman" w:hAnsi="Times New Roman" w:cs="Times New Roman"/>
-                <w:color w:val="000000"/>
-              </w:rPr>
-              <w:t xml:space="preserve"> </w:t>
-            </w:r>
-            <w:r>
-              <w:rPr>
-                <w:rFonts w:ascii="Times New Roman" w:eastAsia="Times New Roman" w:hAnsi="Times New Roman" w:cs="Times New Roman"/>
-                <w:color w:val="000000"/>
-              </w:rPr>
-              <w:t>Советская д.41</w:t>
+              <w:t>{{ employer_address }}</w:t>
             </w:r>
           </w:p>
           <w:p>
@@ -1597,18 +1460,7 @@
               </w:rPr>
             </w:pPr>
             <w:r>
-              <w:rPr>
-                <w:rFonts w:ascii="Times New Roman" w:eastAsia="Times New Roman" w:hAnsi="Times New Roman" w:cs="Times New Roman"/>
-                <w:color w:val="000000"/>
-              </w:rPr>
-              <w:t xml:space="preserve">ИНН </w:t>
-            </w:r>
-            <w:r>
-              <w:rPr>
-                <w:rFonts w:ascii="Times New Roman" w:eastAsia="Times New Roman" w:hAnsi="Times New Roman" w:cs="Times New Roman"/>
-                <w:color w:val="000000"/>
-              </w:rPr>
-              <w:t>312009347140</w:t>
+              <w:t>ИНН {{ employer_inn }}</w:t>
             </w:r>
           </w:p>
           <w:p>
@@ -1620,32 +1472,7 @@
               </w:rPr>
             </w:pPr>
             <w:r>
-              <w:rPr>
-                <w:rFonts w:ascii="Times New Roman" w:eastAsia="Times New Roman" w:hAnsi="Times New Roman" w:cs="Times New Roman"/>
-                <w:color w:val="000000"/>
-              </w:rPr>
-              <w:t>ОГРН</w:t>
-            </w:r>
-            <w:r>
-              <w:rPr>
-                <w:rFonts w:ascii="Times New Roman" w:eastAsia="Times New Roman" w:hAnsi="Times New Roman" w:cs="Times New Roman"/>
-                <w:color w:val="000000"/>
-              </w:rPr>
-              <w:t>ИП</w:t>
-            </w:r>
-            <w:r>
-              <w:rPr>
-                <w:rFonts w:ascii="Times New Roman" w:eastAsia="Times New Roman" w:hAnsi="Times New Roman" w:cs="Times New Roman"/>
-                <w:color w:val="000000"/>
-              </w:rPr>
-              <w:t xml:space="preserve"> </w:t>
-            </w:r>
-            <w:r>
-              <w:rPr>
-                <w:rFonts w:ascii="Times New Roman" w:eastAsia="Times New Roman" w:hAnsi="Times New Roman" w:cs="Times New Roman"/>
-                <w:color w:val="000000"/>
-              </w:rPr>
-              <w:t>319302500024366</w:t>
+              <w:t>ОГРНИП {{ employer_ogrn }}</w:t>
             </w:r>
           </w:p>
           <w:p>
@@ -1758,18 +1585,7 @@
               </w:rPr>
             </w:pPr>
             <w:r>
-              <w:rPr>
-                <w:rFonts w:ascii="Times New Roman" w:eastAsia="Times New Roman" w:hAnsi="Times New Roman" w:cs="Times New Roman"/>
-                <w:color w:val="000000"/>
-              </w:rPr>
-              <w:t xml:space="preserve">ИП </w:t>
-            </w:r>
-            <w:r>
-              <w:rPr>
-                <w:rFonts w:ascii="Times New Roman" w:eastAsia="Times New Roman" w:hAnsi="Times New Roman" w:cs="Times New Roman"/>
-                <w:color w:val="000000"/>
-              </w:rPr>
-              <w:t>Генералов А.В.</w:t>
+              <w:t>ИП {{ short_employer_name }}</w:t>
             </w:r>
           </w:p>
           <w:p>
@@ -1789,20 +1605,7 @@
               </w:rPr>
             </w:pPr>
             <w:r>
-              <w:rPr>
-                <w:rFonts w:ascii="Times New Roman" w:eastAsia="Times New Roman" w:hAnsi="Times New Roman" w:cs="Times New Roman"/>
-                <w:b/>
-                <w:color w:val="000000"/>
-              </w:rPr>
-              <w:t>_____________ /</w:t>
-            </w:r>
-            <w:r>
-              <w:rPr>
-                <w:rFonts w:ascii="Times New Roman" w:eastAsia="Times New Roman" w:hAnsi="Times New Roman" w:cs="Times New Roman"/>
-                <w:b/>
-                <w:color w:val="000000"/>
-              </w:rPr>
-              <w:t>Генералов А.В./</w:t>
+              <w:t>_____________ /{{ short_employer_name }}/</w:t>
             </w:r>
           </w:p>
         </w:tc>

</xml_diff>

<commit_message>
Refactoring & bug fixes: word boundary in FIO parser, move imports, fix hardcoded real phone, fix garbled comment, remove double unique_cells calls, add logging for dropped list values
</commit_message>
<xml_diff>
--- a/bot/templates/template_contract.docx
+++ b/bot/templates/template_contract.docx
@@ -194,7 +194,7 @@
         </w:rPr>
       </w:pPr>
       <w:r>
-        <w:t>Индивидуальный предприниматель Глава крестьянского (фермерского) хозяйства {{ employer_name }}, действующий на основании. ОГРН {{ employer_ogrn }}, ИНН {{ employer_inn }}, именуемый в дальнейшем «Заказчик» и гражданин {{citizenship}} {{full_name}}, {{birth_date}} года рождения, паспорт серия {{passport_series}} №{{passport_number}} выдан {{passport_issue_date}}г. {{passport_issued_by}}, зарегистрированный по адресу: {{address}}, именуемый в дальнейшем «Подрядчик» (далее «Стороны»), заключили настоящий договор о нижеследующем:</w:t>
+        <w:t>{{ employer_name }}, действующий на основании. ОГРН {{ employer_ogrn }}, ИНН {{ employer_inn }}, именуемый в дальнейшем «Заказчик» и гражданин {{citizenship}} {{full_name}}, {{birth_date}} года рождения, паспорт серия {{passport_series}} №{{passport_number}} выдан {{passport_issue_date}}г. {{passport_issued_by}}, зарегистрированный по адресу: {{address}}, именуемый в дальнейшем «Подрядчик» (далее «Стороны»), заключили настоящий договор о нижеследующем:</w:t>
       </w:r>
     </w:p>
     <w:p>
@@ -1436,7 +1436,7 @@
               </w:rPr>
             </w:pPr>
             <w:r>
-              <w:t>ИП ГКФХ {{ employer_name }}</w:t>
+              <w:t>{{ employer_name }}</w:t>
             </w:r>
           </w:p>
           <w:p>

</xml_diff>

<commit_message>
Implement contract bank details dynamic replacement from Partner Card (with fallback to Generalov's bank details); implement profession prompt in FSM flow and auto-fill profession across all notifications and contract
</commit_message>
<xml_diff>
--- a/bot/templates/template_contract.docx
+++ b/bot/templates/template_contract.docx
@@ -1484,18 +1484,7 @@
               </w:rPr>
             </w:pPr>
             <w:r>
-              <w:rPr>
-                <w:rFonts w:ascii="Times New Roman" w:eastAsia="Times New Roman" w:hAnsi="Times New Roman" w:cs="Times New Roman"/>
-                <w:color w:val="000000"/>
-              </w:rPr>
-              <w:t xml:space="preserve">р/с </w:t>
-            </w:r>
-            <w:r>
-              <w:rPr>
-                <w:rFonts w:ascii="Times New Roman" w:eastAsia="Times New Roman" w:hAnsi="Times New Roman" w:cs="Times New Roman"/>
-                <w:color w:val="000000"/>
-              </w:rPr>
-              <w:t>40802810905000025734</w:t>
+              <w:t>р/с {{ employer_rs }}</w:t>
             </w:r>
           </w:p>
           <w:p>
@@ -1507,25 +1496,7 @@
               </w:rPr>
             </w:pPr>
             <w:r>
-              <w:rPr>
-                <w:rFonts w:ascii="Times New Roman" w:eastAsia="Times New Roman" w:hAnsi="Times New Roman" w:cs="Times New Roman"/>
-                <w:color w:val="000000"/>
-              </w:rPr>
-              <w:t xml:space="preserve">к/с </w:t>
-            </w:r>
-            <w:r>
-              <w:rPr>
-                <w:rFonts w:ascii="Times New Roman" w:eastAsia="Times New Roman" w:hAnsi="Times New Roman" w:cs="Times New Roman"/>
-                <w:color w:val="000000"/>
-              </w:rPr>
-              <w:t>3010181</w:t>
-            </w:r>
-            <w:r>
-              <w:rPr>
-                <w:rFonts w:ascii="Times New Roman" w:eastAsia="Times New Roman" w:hAnsi="Times New Roman" w:cs="Times New Roman"/>
-                <w:color w:val="000000"/>
-              </w:rPr>
-              <w:t>0500000000602</w:t>
+              <w:t>к/с {{ employer_ks }}</w:t>
             </w:r>
           </w:p>
           <w:p>
@@ -1537,18 +1508,7 @@
               </w:rPr>
             </w:pPr>
             <w:r>
-              <w:rPr>
-                <w:rFonts w:ascii="Times New Roman" w:eastAsia="Times New Roman" w:hAnsi="Times New Roman" w:cs="Times New Roman"/>
-                <w:color w:val="000000"/>
-              </w:rPr>
-              <w:t xml:space="preserve">БИК </w:t>
-            </w:r>
-            <w:r>
-              <w:rPr>
-                <w:rFonts w:ascii="Times New Roman" w:eastAsia="Times New Roman" w:hAnsi="Times New Roman" w:cs="Times New Roman"/>
-                <w:color w:val="000000"/>
-              </w:rPr>
-              <w:t>041203602</w:t>
+              <w:t>БИК {{ employer_bik }}</w:t>
             </w:r>
           </w:p>
           <w:p>
@@ -1560,11 +1520,7 @@
               </w:rPr>
             </w:pPr>
             <w:r>
-              <w:rPr>
-                <w:rFonts w:ascii="Times New Roman" w:eastAsia="Times New Roman" w:hAnsi="Times New Roman" w:cs="Times New Roman"/>
-                <w:color w:val="000000"/>
-              </w:rPr>
-              <w:t>Астраханское отделение №8625 ПАО СБЕРБАНК</w:t>
+              <w:t>{{ employer_bank }}</w:t>
             </w:r>
           </w:p>
           <w:p>

</xml_diff>

<commit_message>
Fix template_termination passport bug, template_contract hardcoded dates, add missing utils.format_date_ru, and fix generator bank variables
</commit_message>
<xml_diff>
--- a/bot/templates/template_contract.docx
+++ b/bot/templates/template_contract.docx
@@ -67,35 +67,31 @@
           <w:rFonts w:ascii="Times New Roman" w:eastAsia="Times New Roman" w:hAnsi="Times New Roman" w:cs="Times New Roman"/>
           <w:color w:val="000000"/>
         </w:rPr>
-        <w:t>С. Покровка</w:t>
+        <w:t>С. Покровка                                                                                                                    {{ contract_date_ru }}</w:t>
       </w:r>
       <w:r>
         <w:rPr>
           <w:rFonts w:ascii="Times New Roman" w:eastAsia="Times New Roman" w:hAnsi="Times New Roman" w:cs="Times New Roman"/>
           <w:color w:val="000000"/>
         </w:rPr>
-        <w:t xml:space="preserve">                                                                                    </w:t>
       </w:r>
       <w:r>
         <w:rPr>
           <w:rFonts w:ascii="Times New Roman" w:eastAsia="Times New Roman" w:hAnsi="Times New Roman" w:cs="Times New Roman"/>
           <w:color w:val="000000"/>
         </w:rPr>
-        <w:t xml:space="preserve">                         </w:t>
       </w:r>
       <w:r>
         <w:rPr>
           <w:rFonts w:ascii="Times New Roman" w:eastAsia="Times New Roman" w:hAnsi="Times New Roman" w:cs="Times New Roman"/>
           <w:color w:val="000000"/>
         </w:rPr>
-        <w:t xml:space="preserve"> </w:t>
       </w:r>
       <w:r>
         <w:rPr>
           <w:rFonts w:ascii="Times New Roman" w:eastAsia="Times New Roman" w:hAnsi="Times New Roman" w:cs="Times New Roman"/>
           <w:color w:val="000000"/>
         </w:rPr>
-        <w:t xml:space="preserve">   </w:t>
       </w:r>
       <w:proofErr w:type="gramStart"/>
       <w:r>
@@ -103,21 +99,18 @@
           <w:rFonts w:ascii="Times New Roman" w:eastAsia="Times New Roman" w:hAnsi="Times New Roman" w:cs="Times New Roman"/>
           <w:color w:val="000000"/>
         </w:rPr>
-        <w:t xml:space="preserve"> </w:t>
       </w:r>
       <w:r>
         <w:rPr>
           <w:rFonts w:ascii="Times New Roman" w:eastAsia="Times New Roman" w:hAnsi="Times New Roman" w:cs="Times New Roman"/>
           <w:color w:val="000000"/>
         </w:rPr>
-        <w:t xml:space="preserve"> </w:t>
       </w:r>
       <w:r>
         <w:rPr>
           <w:rFonts w:ascii="Times New Roman" w:eastAsia="Times New Roman" w:hAnsi="Times New Roman" w:cs="Times New Roman"/>
           <w:color w:val="000000"/>
         </w:rPr>
-        <w:t xml:space="preserve"> «</w:t>
       </w:r>
       <w:proofErr w:type="gramEnd"/>
       <w:r>
@@ -125,63 +118,54 @@
           <w:rFonts w:ascii="Times New Roman" w:eastAsia="Times New Roman" w:hAnsi="Times New Roman" w:cs="Times New Roman"/>
           <w:color w:val="000000"/>
         </w:rPr>
-        <w:t>1</w:t>
       </w:r>
       <w:r>
         <w:rPr>
           <w:rFonts w:ascii="Times New Roman" w:eastAsia="Times New Roman" w:hAnsi="Times New Roman" w:cs="Times New Roman"/>
           <w:color w:val="000000"/>
         </w:rPr>
-        <w:t>4</w:t>
       </w:r>
       <w:r>
         <w:rPr>
           <w:rFonts w:ascii="Times New Roman" w:eastAsia="Times New Roman" w:hAnsi="Times New Roman" w:cs="Times New Roman"/>
           <w:color w:val="000000"/>
         </w:rPr>
-        <w:t xml:space="preserve">» </w:t>
       </w:r>
       <w:r>
         <w:rPr>
           <w:rFonts w:ascii="Times New Roman" w:eastAsia="Times New Roman" w:hAnsi="Times New Roman" w:cs="Times New Roman"/>
           <w:color w:val="000000"/>
         </w:rPr>
-        <w:t>ма</w:t>
       </w:r>
       <w:r>
         <w:rPr>
           <w:rFonts w:ascii="Times New Roman" w:eastAsia="Times New Roman" w:hAnsi="Times New Roman" w:cs="Times New Roman"/>
           <w:color w:val="000000"/>
         </w:rPr>
-        <w:t>я</w:t>
       </w:r>
       <w:r>
         <w:rPr>
           <w:rFonts w:ascii="Times New Roman" w:eastAsia="Times New Roman" w:hAnsi="Times New Roman" w:cs="Times New Roman"/>
           <w:color w:val="000000"/>
         </w:rPr>
-        <w:t xml:space="preserve"> </w:t>
       </w:r>
       <w:r>
         <w:rPr>
           <w:rFonts w:ascii="Times New Roman" w:eastAsia="Times New Roman" w:hAnsi="Times New Roman" w:cs="Times New Roman"/>
           <w:color w:val="000000"/>
         </w:rPr>
-        <w:t>202</w:t>
       </w:r>
       <w:r>
         <w:rPr>
           <w:rFonts w:ascii="Times New Roman" w:eastAsia="Times New Roman" w:hAnsi="Times New Roman" w:cs="Times New Roman"/>
           <w:color w:val="000000"/>
         </w:rPr>
-        <w:t>6</w:t>
       </w:r>
       <w:r>
         <w:rPr>
           <w:rFonts w:ascii="Times New Roman" w:eastAsia="Times New Roman" w:hAnsi="Times New Roman" w:cs="Times New Roman"/>
           <w:color w:val="000000"/>
         </w:rPr>
-        <w:t>г.</w:t>
       </w:r>
     </w:p>
     <w:p>
@@ -237,31 +221,27 @@
         <w:rPr>
           <w:rFonts w:ascii="Times New Roman" w:hAnsi="Times New Roman" w:cs="Times New Roman"/>
         </w:rPr>
-        <w:t>Договор подряда вступает в силу со дня фактического допущения к работе после получения иност</w:t>
-      </w:r>
-      <w:r>
-        <w:rPr>
-          <w:rFonts w:ascii="Times New Roman" w:hAnsi="Times New Roman" w:cs="Times New Roman"/>
-        </w:rPr>
-        <w:t xml:space="preserve">ранным гражданином патента с </w:t>
-      </w:r>
-      <w:r>
-        <w:rPr>
-          <w:rFonts w:ascii="Times New Roman" w:eastAsia="Times New Roman" w:hAnsi="Times New Roman" w:cs="Times New Roman"/>
-        </w:rPr>
-        <w:t>«</w:t>
-      </w:r>
-      <w:r>
-        <w:rPr>
-          <w:rFonts w:ascii="Times New Roman" w:eastAsia="Times New Roman" w:hAnsi="Times New Roman" w:cs="Times New Roman"/>
-        </w:rPr>
-        <w:t>1</w:t>
-      </w:r>
-      <w:r>
-        <w:rPr>
-          <w:rFonts w:ascii="Times New Roman" w:eastAsia="Times New Roman" w:hAnsi="Times New Roman" w:cs="Times New Roman"/>
-        </w:rPr>
-        <w:t>4</w:t>
+        <w:t xml:space="preserve">Договор подряда вступает в силу со дня фактического допущения к работе после получения иностранным гражданином патента с {{ contract_start_date_ru }} по {{ contract_end_date_ru }} (ст.61 ТК РФ) на должности {{ profession_ru }}. </w:t>
+      </w:r>
+      <w:r>
+        <w:rPr>
+          <w:rFonts w:ascii="Times New Roman" w:hAnsi="Times New Roman" w:cs="Times New Roman"/>
+        </w:rPr>
+      </w:r>
+      <w:r>
+        <w:rPr>
+          <w:rFonts w:ascii="Times New Roman" w:eastAsia="Times New Roman" w:hAnsi="Times New Roman" w:cs="Times New Roman"/>
+        </w:rPr>
+      </w:r>
+      <w:r>
+        <w:rPr>
+          <w:rFonts w:ascii="Times New Roman" w:eastAsia="Times New Roman" w:hAnsi="Times New Roman" w:cs="Times New Roman"/>
+        </w:rPr>
+      </w:r>
+      <w:r>
+        <w:rPr>
+          <w:rFonts w:ascii="Times New Roman" w:eastAsia="Times New Roman" w:hAnsi="Times New Roman" w:cs="Times New Roman"/>
+        </w:rPr>
       </w:r>
       <w:bookmarkStart w:id="0" w:name="_GoBack"/>
       <w:bookmarkEnd w:id="0"/>
@@ -269,97 +249,81 @@
         <w:rPr>
           <w:rFonts w:ascii="Times New Roman" w:eastAsia="Times New Roman" w:hAnsi="Times New Roman" w:cs="Times New Roman"/>
         </w:rPr>
-        <w:t xml:space="preserve">» </w:t>
-      </w:r>
-      <w:r>
-        <w:rPr>
-          <w:rFonts w:ascii="Times New Roman" w:eastAsia="Times New Roman" w:hAnsi="Times New Roman" w:cs="Times New Roman"/>
-        </w:rPr>
-        <w:t>ма</w:t>
-      </w:r>
-      <w:r>
-        <w:rPr>
-          <w:rFonts w:ascii="Times New Roman" w:eastAsia="Times New Roman" w:hAnsi="Times New Roman" w:cs="Times New Roman"/>
-        </w:rPr>
-        <w:t>я</w:t>
-      </w:r>
-      <w:r>
-        <w:rPr>
-          <w:rFonts w:ascii="Times New Roman" w:eastAsia="Times New Roman" w:hAnsi="Times New Roman" w:cs="Times New Roman"/>
-        </w:rPr>
-        <w:t xml:space="preserve"> 202</w:t>
-      </w:r>
-      <w:r>
-        <w:rPr>
-          <w:rFonts w:ascii="Times New Roman" w:eastAsia="Times New Roman" w:hAnsi="Times New Roman" w:cs="Times New Roman"/>
-        </w:rPr>
-        <w:t>6</w:t>
-      </w:r>
-      <w:r>
-        <w:rPr>
-          <w:rFonts w:ascii="Times New Roman" w:eastAsia="Times New Roman" w:hAnsi="Times New Roman" w:cs="Times New Roman"/>
-        </w:rPr>
-        <w:t>г. по «3</w:t>
-      </w:r>
-      <w:r>
-        <w:rPr>
-          <w:rFonts w:ascii="Times New Roman" w:eastAsia="Times New Roman" w:hAnsi="Times New Roman" w:cs="Times New Roman"/>
-        </w:rPr>
-        <w:t>0</w:t>
-      </w:r>
-      <w:r>
-        <w:rPr>
-          <w:rFonts w:ascii="Times New Roman" w:eastAsia="Times New Roman" w:hAnsi="Times New Roman" w:cs="Times New Roman"/>
-        </w:rPr>
-        <w:t xml:space="preserve">» </w:t>
-      </w:r>
-      <w:r>
-        <w:rPr>
-          <w:rFonts w:ascii="Times New Roman" w:eastAsia="Times New Roman" w:hAnsi="Times New Roman" w:cs="Times New Roman"/>
-        </w:rPr>
-        <w:t>но</w:t>
-      </w:r>
-      <w:r>
-        <w:rPr>
-          <w:rFonts w:ascii="Times New Roman" w:eastAsia="Times New Roman" w:hAnsi="Times New Roman" w:cs="Times New Roman"/>
-        </w:rPr>
-        <w:t>ября</w:t>
-      </w:r>
-      <w:r>
-        <w:rPr>
-          <w:rFonts w:ascii="Times New Roman" w:eastAsia="Times New Roman" w:hAnsi="Times New Roman" w:cs="Times New Roman"/>
-        </w:rPr>
-        <w:t xml:space="preserve"> 202</w:t>
-      </w:r>
-      <w:r>
-        <w:rPr>
-          <w:rFonts w:ascii="Times New Roman" w:eastAsia="Times New Roman" w:hAnsi="Times New Roman" w:cs="Times New Roman"/>
-        </w:rPr>
-        <w:t>6</w:t>
-      </w:r>
-      <w:r>
-        <w:rPr>
-          <w:rFonts w:ascii="Times New Roman" w:eastAsia="Times New Roman" w:hAnsi="Times New Roman" w:cs="Times New Roman"/>
-        </w:rPr>
-        <w:t>г.</w:t>
-      </w:r>
-      <w:r>
-        <w:rPr>
-          <w:rFonts w:ascii="Times New Roman" w:hAnsi="Times New Roman" w:cs="Times New Roman"/>
-        </w:rPr>
-        <w:t xml:space="preserve"> (</w:t>
-      </w:r>
-      <w:r>
-        <w:rPr>
-          <w:rFonts w:ascii="Times New Roman" w:hAnsi="Times New Roman" w:cs="Times New Roman"/>
-        </w:rPr>
-        <w:t>ст.61 ТК РФ) на должности Овощевод.</w:t>
-      </w:r>
-      <w:r>
-        <w:rPr>
-          <w:rFonts w:ascii="Times New Roman" w:hAnsi="Times New Roman" w:cs="Times New Roman"/>
-        </w:rPr>
-        <w:t xml:space="preserve"> </w:t>
+      </w:r>
+      <w:r>
+        <w:rPr>
+          <w:rFonts w:ascii="Times New Roman" w:eastAsia="Times New Roman" w:hAnsi="Times New Roman" w:cs="Times New Roman"/>
+        </w:rPr>
+      </w:r>
+      <w:r>
+        <w:rPr>
+          <w:rFonts w:ascii="Times New Roman" w:eastAsia="Times New Roman" w:hAnsi="Times New Roman" w:cs="Times New Roman"/>
+        </w:rPr>
+      </w:r>
+      <w:r>
+        <w:rPr>
+          <w:rFonts w:ascii="Times New Roman" w:eastAsia="Times New Roman" w:hAnsi="Times New Roman" w:cs="Times New Roman"/>
+        </w:rPr>
+      </w:r>
+      <w:r>
+        <w:rPr>
+          <w:rFonts w:ascii="Times New Roman" w:eastAsia="Times New Roman" w:hAnsi="Times New Roman" w:cs="Times New Roman"/>
+        </w:rPr>
+      </w:r>
+      <w:r>
+        <w:rPr>
+          <w:rFonts w:ascii="Times New Roman" w:eastAsia="Times New Roman" w:hAnsi="Times New Roman" w:cs="Times New Roman"/>
+        </w:rPr>
+      </w:r>
+      <w:r>
+        <w:rPr>
+          <w:rFonts w:ascii="Times New Roman" w:eastAsia="Times New Roman" w:hAnsi="Times New Roman" w:cs="Times New Roman"/>
+        </w:rPr>
+      </w:r>
+      <w:r>
+        <w:rPr>
+          <w:rFonts w:ascii="Times New Roman" w:eastAsia="Times New Roman" w:hAnsi="Times New Roman" w:cs="Times New Roman"/>
+        </w:rPr>
+      </w:r>
+      <w:r>
+        <w:rPr>
+          <w:rFonts w:ascii="Times New Roman" w:eastAsia="Times New Roman" w:hAnsi="Times New Roman" w:cs="Times New Roman"/>
+        </w:rPr>
+      </w:r>
+      <w:r>
+        <w:rPr>
+          <w:rFonts w:ascii="Times New Roman" w:eastAsia="Times New Roman" w:hAnsi="Times New Roman" w:cs="Times New Roman"/>
+        </w:rPr>
+      </w:r>
+      <w:r>
+        <w:rPr>
+          <w:rFonts w:ascii="Times New Roman" w:eastAsia="Times New Roman" w:hAnsi="Times New Roman" w:cs="Times New Roman"/>
+        </w:rPr>
+      </w:r>
+      <w:r>
+        <w:rPr>
+          <w:rFonts w:ascii="Times New Roman" w:eastAsia="Times New Roman" w:hAnsi="Times New Roman" w:cs="Times New Roman"/>
+        </w:rPr>
+      </w:r>
+      <w:r>
+        <w:rPr>
+          <w:rFonts w:ascii="Times New Roman" w:eastAsia="Times New Roman" w:hAnsi="Times New Roman" w:cs="Times New Roman"/>
+        </w:rPr>
+      </w:r>
+      <w:r>
+        <w:rPr>
+          <w:rFonts w:ascii="Times New Roman" w:hAnsi="Times New Roman" w:cs="Times New Roman"/>
+        </w:rPr>
+      </w:r>
+      <w:r>
+        <w:rPr>
+          <w:rFonts w:ascii="Times New Roman" w:hAnsi="Times New Roman" w:cs="Times New Roman"/>
+        </w:rPr>
+      </w:r>
+      <w:r>
+        <w:rPr>
+          <w:rFonts w:ascii="Times New Roman" w:hAnsi="Times New Roman" w:cs="Times New Roman"/>
+        </w:rPr>
       </w:r>
     </w:p>
     <w:p>

</xml_diff>